<commit_message>
docs(ip): add concrete training embodiment
</commit_message>
<xml_diff>
--- a/docs/ip/Morphz_结构化认知状态转换训练_发明专利申请文件_v1.docx
+++ b/docs/ip/Morphz_结构化认知状态转换训练_发明专利申请文件_v1.docx
@@ -1441,7 +1441,7 @@
           <w:color w:val="000000"/>
           <w:sz w:val="22"/>
         </w:rPr>
-        <w:t>[0083] 训练过程能够设置防泄漏校验，例如在输入序列中搜索目标对象摘要、结果字段路径或者决策后才出现的稳定标识；能够构造时间切分、任务切分、主体切分或者状态对象切分的数据集，以降低同一轨迹或者同一对象同时进入训练集和评测集所造成的数据重叠。</w:t>
+        <w:t>[0083] 在一种具体的监督微调实施方式中，待训练语言模型采用仅解码器式Transformer结构，包括令牌嵌入模块、依次连接的多层自注意力模块和前馈网络模块以及输出映射模块。训练片段按照序列化协议依次形成模型输入区和监督目标区，输入区与目标区之间设置角色边界标记；训练掩码将输入区、环境输出区、评价区、元数据区和排除区对应位置的损失权重设为零，将监督目标区对应位置的损失权重设为一，使参数更新仅依据监督目标区的预测误差进行。</w:t>
       </w:r>
     </w:p>
     <w:p>
@@ -1456,7 +1456,7 @@
           <w:color w:val="000000"/>
           <w:sz w:val="22"/>
         </w:rPr>
-        <w:t>[0084] 模型评测能够包括状态更新合法率、陈旧版本引用率、权限越界率、因果引用闭合率、认知帧修订正确性、运行时接纳率、现实任务完成情况以及在未见任务上的迁移情况中的至少一种。所述指标用于比较模型版本或者训练数据构造方式，不要求在专利实施时预先达到固定数值。</w:t>
+        <w:t>[0084] 在所述监督微调实施方式的一组示例性训练配置中，采用与基础模型匹配的分词器，将最大序列长度设置为4096个令牌，将训练批次大小设置为32，将训练轮次设置为3，采用AdamW优化器并将学习率设置为0.00002；在自注意力模块的查询、键、值及输出投影矩阵上设置秩为16、缩放系数为32且丢弃率为0.05的低秩适配参数，并冻结基础模型的其余参数。训练数据按照任务稳定标识进行互斥划分，使同一任务派生的训练片段仅进入训练集、验证集或者测试集之一。上述数值用于说明可执行的训练配置，能够根据基础模型规模、计算资源和应用场景进行调整。</w:t>
       </w:r>
     </w:p>
     <w:p>
@@ -1471,7 +1471,7 @@
           <w:color w:val="000000"/>
           <w:sz w:val="22"/>
         </w:rPr>
-        <w:t>[0085] 本实施方式描述的是可由计算机执行的训练流程及数据约束。具体模型规模、训练批次、优化器、学习率、训练轮次和评价任务能够根据计算资源与应用场景确定，而不影响结构化认知状态转换、决策时状态视图、训练掩码及权威结果关联的技术组合。</w:t>
+        <w:t>[0085] 训练过程能够设置防泄漏校验，例如在输入序列中搜索目标对象摘要、结果字段路径或者决策后才出现的稳定标识；能够构造时间切分、任务切分、主体切分或者状态对象切分的数据集，以降低同一轨迹或者同一对象同时进入训练集和评测集所造成的数据重叠。</w:t>
       </w:r>
     </w:p>
     <w:p>
@@ -1486,7 +1486,7 @@
           <w:color w:val="000000"/>
           <w:sz w:val="22"/>
         </w:rPr>
-        <w:t>[0086] 在多线程场景中，每一决策和状态转换绑定线程标识及基础状态版本。因果图允许不同线程并行读取互不冲突的对象，也允许在汇合节点合并结果。若不同线程写入同一对象或者读取基础版本失效，运行时生成冲突事实，数据构造系统据此区分成功提交、重试和放弃路径。</w:t>
+        <w:t>[0086] 模型评测能够包括状态更新合法率、陈旧版本引用率、权限越界率、因果引用闭合率、认知帧修订正确性、运行时接纳率、现实任务完成情况以及在未见任务上的迁移情况中的至少一种。所述指标用于比较模型版本或者训练数据构造方式，不要求在专利实施时预先达到固定数值。</w:t>
       </w:r>
     </w:p>
     <w:p>
@@ -1501,7 +1501,7 @@
           <w:color w:val="000000"/>
           <w:sz w:val="22"/>
         </w:rPr>
-        <w:t>[0087] 在进程中断或者跨会话恢复场景中，系统根据稳定标识、未完成执行尝试、状态版本和继续信息恢复轨迹关联。恢复后产生的新执行尝试引用原尝试或者原候选提议，避免被误认为与先前决策无关的新样本。</w:t>
+        <w:t>[0087] 本实施方式描述的是可由计算机执行的训练流程及数据约束。具体模型规模、训练批次、优化器、学习率、训练轮次和评价任务能够根据计算资源与应用场景确定，而不影响结构化认知状态转换、决策时状态视图、训练掩码及权威结果关联的技术组合。</w:t>
       </w:r>
     </w:p>
     <w:p>
@@ -1516,7 +1516,7 @@
           <w:color w:val="000000"/>
           <w:sz w:val="22"/>
         </w:rPr>
-        <w:t>[0088] 对于没有最终结果的截断轨迹，系统能够仅输出用于状态理解或者下一步提议的训练片段，也能够标记为未完成并排除于需要结果监督的训练任务。系统不把缺少结果自动解释为失败或者成功。</w:t>
+        <w:t>[0088] 在多线程场景中，每一决策和状态转换绑定线程标识及基础状态版本。因果图允许不同线程并行读取互不冲突的对象，也允许在汇合节点合并结果。若不同线程写入同一对象或者读取基础版本失效，运行时生成冲突事实，数据构造系统据此区分成功提交、重试和放弃路径。</w:t>
       </w:r>
     </w:p>
     <w:p>
@@ -1531,7 +1531,7 @@
           <w:color w:val="000000"/>
           <w:sz w:val="22"/>
         </w:rPr>
-        <w:t>[0089] 权限声明能够指定数据是否允许用于训练、允许的模型或者组织范围、允许的训练任务、有效期、地域和再分发限制。仅当训练片段涉及的必要事实均满足适用权限时，校验与权限控制单元180才允许所述训练片段进入相应训练数据集。</w:t>
+        <w:t>[0089] 在进程中断或者跨会话恢复场景中，系统根据稳定标识、未完成执行尝试、状态版本和继续信息恢复轨迹关联。恢复后产生的新执行尝试引用原尝试或者原候选提议，避免被误认为与先前决策无关的新样本。</w:t>
       </w:r>
     </w:p>
     <w:p>
@@ -1546,7 +1546,7 @@
           <w:color w:val="000000"/>
           <w:sz w:val="22"/>
         </w:rPr>
-        <w:t>[0090] 脱敏处理能够在保留因果结构和类型信息的同时替换或者删除个人信息、客户数据、凭据、源代码片段或者其他受限制内容。脱敏后的字段携带脱敏原因、处理规则版本和原内容摘要的受控引用，以便验证同一原始事实是否被重复导出，而无需暴露原内容。</w:t>
+        <w:t>[0090] 对于没有最终结果的截断轨迹，系统能够仅输出用于状态理解或者下一步提议的训练片段，也能够标记为未完成并排除于需要结果监督的训练任务。系统不把缺少结果自动解释为失败或者成功。</w:t>
       </w:r>
     </w:p>
     <w:p>
@@ -1561,7 +1561,7 @@
           <w:color w:val="000000"/>
           <w:sz w:val="22"/>
         </w:rPr>
-        <w:t>[0091] 完整性信息能够包括单个事实摘要、训练片段摘要、事实集合的树形摘要、数字签名或者可信时间戳。训练开始前，系统验证训练片段引用的事实、掩码和权限声明未被未授权修改。</w:t>
+        <w:t>[0091] 权限声明能够指定数据是否允许用于训练、允许的模型或者组织范围、允许的训练任务、有效期、地域和再分发限制。仅当训练片段涉及的必要事实均满足适用权限时，校验与权限控制单元180才允许所述训练片段进入相应训练数据集。</w:t>
       </w:r>
     </w:p>
     <w:p>
@@ -1576,7 +1576,7 @@
           <w:color w:val="000000"/>
           <w:sz w:val="22"/>
         </w:rPr>
-        <w:t>[0092] 若后续发现某一来源事实权限撤销、验证器存在缺陷或者奖励策略错误，系统能够根据稳定引用定位受影响的训练片段和模型训练批次，将其排除、重新派生或者标记模型版本受影响，而无需删除未受影响的权威事实。</w:t>
+        <w:t>[0092] 脱敏处理能够在保留因果结构和类型信息的同时替换或者删除个人信息、客户数据、凭据、源代码片段或者其他受限制内容。脱敏后的字段携带脱敏原因、处理规则版本和原内容摘要的受控引用，以便验证同一原始事实是否被重复导出，而无需暴露原内容。</w:t>
       </w:r>
     </w:p>
     <w:p>
@@ -1591,7 +1591,7 @@
           <w:color w:val="000000"/>
           <w:sz w:val="22"/>
         </w:rPr>
-        <w:t>[0093] 数据构造和模型训练能够在不同安全域中执行。数据构造环境能够只向训练环境输出经过权限投影和脱敏的训练片段；训练环境无须直接访问完整权威事件存储。内容摘要和导出清单用于验证两侧数据的一致性。</w:t>
+        <w:t>[0093] 完整性信息能够包括单个事实摘要、训练片段摘要、事实集合的树形摘要、数字签名或者可信时间戳。训练开始前，系统验证训练片段引用的事实、掩码和权限声明未被未授权修改。</w:t>
       </w:r>
     </w:p>
     <w:p>
@@ -1606,7 +1606,7 @@
           <w:color w:val="000000"/>
           <w:sz w:val="22"/>
         </w:rPr>
-        <w:t>[0094] 上述结构化认知状态不以特定语法形式为限。其能够采用S表达式、对象树、图结构、抽象语法树、关系表、键值对象、协议缓冲结构或者其他能够表达类型、引用、关系和版本的结构表示或序列化。</w:t>
+        <w:t>[0094] 若后续发现某一来源事实权限撤销、验证器存在缺陷或者奖励策略错误，系统能够根据稳定引用定位受影响的训练片段和模型训练批次，将其排除、重新派生或者标记模型版本受影响，而无需删除未受影响的权威事实。</w:t>
       </w:r>
     </w:p>
     <w:p>
@@ -1621,7 +1621,7 @@
           <w:color w:val="000000"/>
           <w:sz w:val="22"/>
         </w:rPr>
-        <w:t>[0095] 各单元能够由软件、硬件、固件或者其组合实现。多个单元能够合并为一个组件，一个单元也能够拆分为多个服务；只要其执行的功能及数据边界与本发明一致，均属于本发明的实施方式。</w:t>
+        <w:t>[0095] 数据构造和模型训练能够在不同安全域中执行。数据构造环境能够只向训练环境输出经过权限投影和脱敏的训练片段；训练环境无须直接访问完整权威事件存储。内容摘要和导出清单用于验证两侧数据的一致性。</w:t>
       </w:r>
     </w:p>
     <w:p>
@@ -1636,7 +1636,7 @@
           <w:color w:val="000000"/>
           <w:sz w:val="22"/>
         </w:rPr>
-        <w:t>[0096] 本领域技术人员能够理解，流程步骤的编号用于说明而非限定绝对执行顺序。在保证决策时可见性、因果关系、权威边界和训练掩码语义的前提下，部分步骤能够并行、合并或者调整顺序。</w:t>
+        <w:t>[0096] 上述结构化认知状态不以特定语法形式为限。其能够采用S表达式、对象树、图结构、抽象语法树、关系表、键值对象、协议缓冲结构或者其他能够表达类型、引用、关系和版本的结构表示或序列化。</w:t>
       </w:r>
     </w:p>
     <w:p>
@@ -1651,7 +1651,37 @@
           <w:color w:val="000000"/>
           <w:sz w:val="22"/>
         </w:rPr>
-        <w:t>[0097] 以上实施方式中的具体标识、字段名称、版本号、模型训练方式和应用场景仅为示例。本发明的保护范围以权利要求为准。</w:t>
+        <w:t>[0097] 各单元能够由软件、硬件、固件或者其组合实现。多个单元能够合并为一个组件，一个单元也能够拆分为多个服务；只要其执行的功能及数据边界与本发明一致，均属于本发明的实施方式。</w:t>
+      </w:r>
+    </w:p>
+    <w:p>
+      <w:pPr>
+        <w:pStyle w:val="PatentBody"/>
+        <w:keepNext w:val="0"/>
+        <w:keepLines w:val="0"/>
+      </w:pPr>
+      <w:r>
+        <w:rPr>
+          <w:rFonts w:ascii="STSong" w:hAnsi="STSong" w:eastAsia="STSong"/>
+          <w:color w:val="000000"/>
+          <w:sz w:val="22"/>
+        </w:rPr>
+        <w:t>[0098] 本领域技术人员能够理解，流程步骤的编号用于说明而非限定绝对执行顺序。在保证决策时可见性、因果关系、权威边界和训练掩码语义的前提下，部分步骤能够并行、合并或者调整顺序。</w:t>
+      </w:r>
+    </w:p>
+    <w:p>
+      <w:pPr>
+        <w:pStyle w:val="PatentBody"/>
+        <w:keepNext w:val="0"/>
+        <w:keepLines w:val="0"/>
+      </w:pPr>
+      <w:r>
+        <w:rPr>
+          <w:rFonts w:ascii="STSong" w:hAnsi="STSong" w:eastAsia="STSong"/>
+          <w:color w:val="000000"/>
+          <w:sz w:val="22"/>
+        </w:rPr>
+        <w:t>[0099] 以上实施方式中的具体标识、字段名称、版本号、模型训练方式和应用场景仅为示例。本发明的保护范围以权利要求为准。</w:t>
       </w:r>
     </w:p>
     <w:p>

</xml_diff>